<commit_message>
Agrega carpeta PARA con informe, presentacion, piezas visuales y asistente Robi
</commit_message>
<xml_diff>
--- a/PARA/G7_Informe_PARA_SCA.docx
+++ b/PARA/G7_Informe_PARA_SCA.docx
@@ -694,7 +694,21 @@
           <w:sz w:val="22"/>
           <w:szCs w:val="22"/>
         </w:rPr>
-        <w:t xml:space="preserve">En RBG Ingeniería y Mantenimiento la asistencia del personal de obra se registra con fotos y mensajes en grupos de WhatsApp. La Asistente contable revisa esos mensajes para preparar la nómina, y eso deja información dispersa, registros duplicados o incompletos y errores al sumar las horas. Nuestro proyecto es el análisis y diseño de un sistema web que centraliza esas marcaciones por código QR, por enlace personal con ubicación o por la cuenta del Supervisor, y que genera reportes de horas en PDF y XLSX.</w:t>
+        <w:t xml:space="preserve">En RBG Ingeniería y Mantenimiento la asistencia del personal de obra se registra con fotos y mensajes en grupos de WhatsApp. La Asistente contable revisa esos mensajes para preparar la nómina, y eso deja información dispersa, registros duplicados o incompletos y errores al sumar las horas. Nuestro proyecto es el análisis y diseño completo del Sistema de Control de Asistencia (SCA) que describe el SRS_RBG_V4. Es un sistema web responsivo con 9 módulos: usuarios y roles, personal de obra, obras y asignaciones, códigos QR, registro de asistencia, novedades y correcciones, consultas e historial, y cálculo y reportes de horas en PDF y XLSX. La asistencia se marca por código QR cuando hay Supervisor en la obra, por enlace personal con ubicación cuando no lo hay, o con la cuenta del propio Supervisor, y si no hay internet las marcaciones se guardan cifradas y se sincronizan después. En total el SRS tiene 6 actores, 9 casos de uso de nivel 0, 47 subrequerimientos funcionales y 36 requisitos no funcionales.</w:t>
+      </w:r>
+    </w:p>
+    <w:p>
+      <w:pPr>
+        <w:spacing w:after="120" w:line="300"/>
+        <w:jc w:val="both"/>
+      </w:pPr>
+      <w:r>
+        <w:rPr>
+          <w:rFonts w:ascii="Calibri" w:cs="Calibri" w:eastAsia="Calibri" w:hAnsi="Calibri"/>
+          <w:sz w:val="22"/>
+          <w:szCs w:val="22"/>
+        </w:rPr>
+        <w:t xml:space="preserve">En la Unidad 1 evaluamos la calidad de los casos de uso de nivel 0 con la lista IREB y obtuvimos 94 % de cumplimiento. También modelamos con PlantUML los casos CU-01, CU-02, CU-03 y CU-06, con su matriz RF-CU, sus clases de análisis y sus secuencias, en las Guías 1 y 2. Los otros cinco casos de uso se modelan en las siguientes unidades.</w:t>
       </w:r>
     </w:p>
     <w:p>
@@ -1985,7 +1999,7 @@
             </w:tcMar>
           </w:tcPr>
           <w:p>
-            <w:hyperlink w:history="1" r:id="rId7t0eo-yapkwsuoz-bm4qm">
+            <w:hyperlink w:history="1" r:id="rIdj0io1xt6a3kzhh85cbijh">
               <w:r>
                 <w:rPr>
                   <w:rStyle w:val="Hyperlink"/>
@@ -2079,7 +2093,7 @@
             </w:tcMar>
           </w:tcPr>
           <w:p>
-            <w:hyperlink w:history="1" r:id="rId9jk7l6vidmizvdwobfv_y">
+            <w:hyperlink w:history="1" r:id="rIdcvpea610ebitwa3tsmpff">
               <w:r>
                 <w:rPr>
                   <w:rStyle w:val="Hyperlink"/>
@@ -2434,7 +2448,7 @@
         </w:rPr>
         <w:t xml:space="preserve">Creamos el Gem "Tutor SCA RBG" en Gemini. En sus instrucciones pusimos el problema, el alcance, los seis actores, los nueve casos de uso de nivel 0, la trazabilidad RF-CU de los cuatro casos de las guías, las clases de análisis y los resultados del informe IREB. También le pusimos la regla de responder solo con esa información y decir cuando algo no está en la documentación. Sirve para preguntar sobre el proyecto y para que nos haga preguntas de repaso. Enlace: </w:t>
       </w:r>
-      <w:hyperlink w:history="1" r:id="rIdicnzugq7lxzkaccyanihr">
+      <w:hyperlink w:history="1" r:id="rIdn7vip-ei0tcksf4oqgqdh">
         <w:r>
           <w:rPr>
             <w:rStyle w:val="Hyperlink"/>
@@ -2723,7 +2737,7 @@
         </w:rPr>
         <w:t xml:space="preserve">Juego publicado: </w:t>
       </w:r>
-      <w:hyperlink w:history="1" r:id="rIdjs7lldale9hyc1snslqrx">
+      <w:hyperlink w:history="1" r:id="rId3kh1yql9cov6qmugdwoim">
         <w:r>
           <w:rPr>
             <w:rStyle w:val="Hyperlink"/>
@@ -2748,7 +2762,7 @@
         </w:rPr>
         <w:t xml:space="preserve">Conversación con el prompt: </w:t>
       </w:r>
-      <w:hyperlink w:history="1" r:id="rIdestjwxgbmprneyjwhfpiv">
+      <w:hyperlink w:history="1" r:id="rId7hon0i-clkwo8s-t6mtoz">
         <w:r>
           <w:rPr>
             <w:rStyle w:val="Hyperlink"/>
@@ -3268,7 +3282,7 @@
         </w:rPr>
         <w:t xml:space="preserve">Carpeta de piezas visuales: </w:t>
       </w:r>
-      <w:hyperlink w:history="1" r:id="rIdp2wa7p6to62homjkophvn">
+      <w:hyperlink w:history="1" r:id="rIdo2leolhnjbzo9wzobqxhz">
         <w:r>
           <w:rPr>
             <w:rStyle w:val="Hyperlink"/>
@@ -3293,7 +3307,7 @@
         </w:rPr>
         <w:t xml:space="preserve">Conversación del logo en Gemini: </w:t>
       </w:r>
-      <w:hyperlink w:history="1" r:id="rIdpsn8qtq5bh7w9zgufxzep">
+      <w:hyperlink w:history="1" r:id="rIdvwvxswulukrottfzapa-3">
         <w:r>
           <w:rPr>
             <w:rStyle w:val="Hyperlink"/>
@@ -3549,7 +3563,7 @@
             </w:tcMar>
           </w:tcPr>
           <w:p>
-            <w:hyperlink w:history="1" r:id="rIdayh7emee-zzkhgewo_62i">
+            <w:hyperlink w:history="1" r:id="rIdqexx2w9slohcl_iulq6bx">
               <w:r>
                 <w:rPr>
                   <w:rStyle w:val="Hyperlink"/>
@@ -3614,7 +3628,7 @@
             </w:tcMar>
           </w:tcPr>
           <w:p>
-            <w:hyperlink w:history="1" r:id="rIdbfo1vbdls3b2el1w3-1eo">
+            <w:hyperlink w:history="1" r:id="rId_5grqbmbhig-p0-fn9pmd">
               <w:r>
                 <w:rPr>
                   <w:rStyle w:val="Hyperlink"/>
@@ -3679,7 +3693,7 @@
             </w:tcMar>
           </w:tcPr>
           <w:p>
-            <w:hyperlink w:history="1" r:id="rIdqlrjsbslwzou8xt3qakqd">
+            <w:hyperlink w:history="1" r:id="rIdqtyhzhtu9uxq_kxjuh4a7">
               <w:r>
                 <w:rPr>
                   <w:rStyle w:val="Hyperlink"/>
@@ -3744,7 +3758,7 @@
             </w:tcMar>
           </w:tcPr>
           <w:p>
-            <w:hyperlink w:history="1" r:id="rIdjvo7yttmr_xvasdli2fgr">
+            <w:hyperlink w:history="1" r:id="rIdm4skoeqjhxwzv6g6babdr">
               <w:r>
                 <w:rPr>
                   <w:rStyle w:val="Hyperlink"/>
@@ -3809,7 +3823,7 @@
             </w:tcMar>
           </w:tcPr>
           <w:p>
-            <w:hyperlink w:history="1" r:id="rIdengogeiahvltxmus3n0w0">
+            <w:hyperlink w:history="1" r:id="rId2vekr5ec9gsg0h4rpusej">
               <w:r>
                 <w:rPr>
                   <w:rStyle w:val="Hyperlink"/>
@@ -3874,7 +3888,7 @@
             </w:tcMar>
           </w:tcPr>
           <w:p>
-            <w:hyperlink w:history="1" r:id="rIduexqwnodl8d6cd2ma1kdu">
+            <w:hyperlink w:history="1" r:id="rIdztuflqvw-erm4cqfheman">
               <w:r>
                 <w:rPr>
                   <w:rStyle w:val="Hyperlink"/>

</xml_diff>